<commit_message>
Add the final ethics and AI usage log; complete the report's AI acknowledgement
- report/BIN381_M3_Ethics_and_AI_Usage_Log (.docx and .pdf): Timothy's, Rudi's and Alexander's entries combined
- report updated with Rudi's and Alexander's AI-use statements
</commit_message>
<xml_diff>
--- a/report/BIN381_M3_Report_Group_P1.docx
+++ b/report/BIN381_M3_Report_Group_P1.docx
@@ -351,7 +351,7 @@
     <w:sdt>
       <w:sdtPr>
         <w:alias w:val="Contents"/>
-        <w:id w:val="-1488166673"/>
+        <w:id w:val="1674456367"/>
       </w:sdtPr>
       <w:sdtEndPr/>
       <w:sdtContent>
@@ -380,7 +380,7 @@
           <w:r>
             <w:fldChar w:fldCharType="separate"/>
           </w:r>
-          <w:hyperlink w:anchor="_Toc242211655" w:history="1">
+          <w:hyperlink w:anchor="_Toc242212643" w:history="1">
             <w:r>
               <w:rPr>
                 <w:rStyle w:val="Hyperlink"/>
@@ -404,7 +404,7 @@
               <w:rPr>
                 <w:noProof/>
               </w:rPr>
-              <w:instrText xml:space="preserve"> PAGEREF _Toc242211655 \h </w:instrText>
+              <w:instrText xml:space="preserve"> PAGEREF _Toc242212643 \h </w:instrText>
             </w:r>
             <w:r>
               <w:rPr>
@@ -447,7 +447,7 @@
               <w14:ligatures w14:val="standardContextual"/>
             </w:rPr>
           </w:pPr>
-          <w:hyperlink w:anchor="_Toc242211656" w:history="1">
+          <w:hyperlink w:anchor="_Toc242212644" w:history="1">
             <w:r>
               <w:rPr>
                 <w:rStyle w:val="Hyperlink"/>
@@ -471,7 +471,7 @@
               <w:rPr>
                 <w:noProof/>
               </w:rPr>
-              <w:instrText xml:space="preserve"> PAGEREF _Toc242211656 \h </w:instrText>
+              <w:instrText xml:space="preserve"> PAGEREF _Toc242212644 \h </w:instrText>
             </w:r>
             <w:r>
               <w:rPr>
@@ -514,7 +514,7 @@
               <w14:ligatures w14:val="standardContextual"/>
             </w:rPr>
           </w:pPr>
-          <w:hyperlink w:anchor="_Toc242211657" w:history="1">
+          <w:hyperlink w:anchor="_Toc242212645" w:history="1">
             <w:r>
               <w:rPr>
                 <w:rStyle w:val="Hyperlink"/>
@@ -538,7 +538,7 @@
               <w:rPr>
                 <w:noProof/>
               </w:rPr>
-              <w:instrText xml:space="preserve"> PAGEREF _Toc242211657 \h </w:instrText>
+              <w:instrText xml:space="preserve"> PAGEREF _Toc242212645 \h </w:instrText>
             </w:r>
             <w:r>
               <w:rPr>
@@ -581,7 +581,7 @@
               <w14:ligatures w14:val="standardContextual"/>
             </w:rPr>
           </w:pPr>
-          <w:hyperlink w:anchor="_Toc242211658" w:history="1">
+          <w:hyperlink w:anchor="_Toc242212646" w:history="1">
             <w:r>
               <w:rPr>
                 <w:rStyle w:val="Hyperlink"/>
@@ -605,7 +605,7 @@
               <w:rPr>
                 <w:noProof/>
               </w:rPr>
-              <w:instrText xml:space="preserve"> PAGEREF _Toc242211658 \h </w:instrText>
+              <w:instrText xml:space="preserve"> PAGEREF _Toc242212646 \h </w:instrText>
             </w:r>
             <w:r>
               <w:rPr>
@@ -648,7 +648,7 @@
               <w14:ligatures w14:val="standardContextual"/>
             </w:rPr>
           </w:pPr>
-          <w:hyperlink w:anchor="_Toc242211659" w:history="1">
+          <w:hyperlink w:anchor="_Toc242212647" w:history="1">
             <w:r>
               <w:rPr>
                 <w:rStyle w:val="Hyperlink"/>
@@ -672,7 +672,7 @@
               <w:rPr>
                 <w:noProof/>
               </w:rPr>
-              <w:instrText xml:space="preserve"> PAGEREF _Toc242211659 \h </w:instrText>
+              <w:instrText xml:space="preserve"> PAGEREF _Toc242212647 \h </w:instrText>
             </w:r>
             <w:r>
               <w:rPr>
@@ -715,7 +715,7 @@
               <w14:ligatures w14:val="standardContextual"/>
             </w:rPr>
           </w:pPr>
-          <w:hyperlink w:anchor="_Toc242211660" w:history="1">
+          <w:hyperlink w:anchor="_Toc242212648" w:history="1">
             <w:r>
               <w:rPr>
                 <w:rStyle w:val="Hyperlink"/>
@@ -739,7 +739,7 @@
               <w:rPr>
                 <w:noProof/>
               </w:rPr>
-              <w:instrText xml:space="preserve"> PAGEREF _Toc242211660 \h </w:instrText>
+              <w:instrText xml:space="preserve"> PAGEREF _Toc242212648 \h </w:instrText>
             </w:r>
             <w:r>
               <w:rPr>
@@ -782,7 +782,7 @@
               <w14:ligatures w14:val="standardContextual"/>
             </w:rPr>
           </w:pPr>
-          <w:hyperlink w:anchor="_Toc242211661" w:history="1">
+          <w:hyperlink w:anchor="_Toc242212649" w:history="1">
             <w:r>
               <w:rPr>
                 <w:rStyle w:val="Hyperlink"/>
@@ -806,7 +806,7 @@
               <w:rPr>
                 <w:noProof/>
               </w:rPr>
-              <w:instrText xml:space="preserve"> PAGEREF _Toc242211661 \h </w:instrText>
+              <w:instrText xml:space="preserve"> PAGEREF _Toc242212649 \h </w:instrText>
             </w:r>
             <w:r>
               <w:rPr>
@@ -849,7 +849,7 @@
               <w14:ligatures w14:val="standardContextual"/>
             </w:rPr>
           </w:pPr>
-          <w:hyperlink w:anchor="_Toc242211662" w:history="1">
+          <w:hyperlink w:anchor="_Toc242212650" w:history="1">
             <w:r>
               <w:rPr>
                 <w:rStyle w:val="Hyperlink"/>
@@ -873,7 +873,7 @@
               <w:rPr>
                 <w:noProof/>
               </w:rPr>
-              <w:instrText xml:space="preserve"> PAGEREF _Toc242211662 \h </w:instrText>
+              <w:instrText xml:space="preserve"> PAGEREF _Toc242212650 \h </w:instrText>
             </w:r>
             <w:r>
               <w:rPr>
@@ -916,7 +916,7 @@
               <w14:ligatures w14:val="standardContextual"/>
             </w:rPr>
           </w:pPr>
-          <w:hyperlink w:anchor="_Toc242211663" w:history="1">
+          <w:hyperlink w:anchor="_Toc242212651" w:history="1">
             <w:r>
               <w:rPr>
                 <w:rStyle w:val="Hyperlink"/>
@@ -940,7 +940,7 @@
               <w:rPr>
                 <w:noProof/>
               </w:rPr>
-              <w:instrText xml:space="preserve"> PAGEREF _Toc242211663 \h </w:instrText>
+              <w:instrText xml:space="preserve"> PAGEREF _Toc242212651 \h </w:instrText>
             </w:r>
             <w:r>
               <w:rPr>
@@ -983,7 +983,7 @@
               <w14:ligatures w14:val="standardContextual"/>
             </w:rPr>
           </w:pPr>
-          <w:hyperlink w:anchor="_Toc242211664" w:history="1">
+          <w:hyperlink w:anchor="_Toc242212652" w:history="1">
             <w:r>
               <w:rPr>
                 <w:rStyle w:val="Hyperlink"/>
@@ -1007,7 +1007,7 @@
               <w:rPr>
                 <w:noProof/>
               </w:rPr>
-              <w:instrText xml:space="preserve"> PAGEREF _Toc242211664 \h </w:instrText>
+              <w:instrText xml:space="preserve"> PAGEREF _Toc242212652 \h </w:instrText>
             </w:r>
             <w:r>
               <w:rPr>
@@ -1050,7 +1050,7 @@
               <w14:ligatures w14:val="standardContextual"/>
             </w:rPr>
           </w:pPr>
-          <w:hyperlink w:anchor="_Toc242211665" w:history="1">
+          <w:hyperlink w:anchor="_Toc242212653" w:history="1">
             <w:r>
               <w:rPr>
                 <w:rStyle w:val="Hyperlink"/>
@@ -1074,7 +1074,7 @@
               <w:rPr>
                 <w:noProof/>
               </w:rPr>
-              <w:instrText xml:space="preserve"> PAGEREF _Toc242211665 \h </w:instrText>
+              <w:instrText xml:space="preserve"> PAGEREF _Toc242212653 \h </w:instrText>
             </w:r>
             <w:r>
               <w:rPr>
@@ -1117,7 +1117,7 @@
               <w14:ligatures w14:val="standardContextual"/>
             </w:rPr>
           </w:pPr>
-          <w:hyperlink w:anchor="_Toc242211666" w:history="1">
+          <w:hyperlink w:anchor="_Toc242212654" w:history="1">
             <w:r>
               <w:rPr>
                 <w:rStyle w:val="Hyperlink"/>
@@ -1141,7 +1141,7 @@
               <w:rPr>
                 <w:noProof/>
               </w:rPr>
-              <w:instrText xml:space="preserve"> PAGEREF _Toc242211666 \h </w:instrText>
+              <w:instrText xml:space="preserve"> PAGEREF _Toc242212654 \h </w:instrText>
             </w:r>
             <w:r>
               <w:rPr>
@@ -1184,7 +1184,7 @@
               <w14:ligatures w14:val="standardContextual"/>
             </w:rPr>
           </w:pPr>
-          <w:hyperlink w:anchor="_Toc242211667" w:history="1">
+          <w:hyperlink w:anchor="_Toc242212655" w:history="1">
             <w:r>
               <w:rPr>
                 <w:rStyle w:val="Hyperlink"/>
@@ -1208,7 +1208,7 @@
               <w:rPr>
                 <w:noProof/>
               </w:rPr>
-              <w:instrText xml:space="preserve"> PAGEREF _Toc242211667 \h </w:instrText>
+              <w:instrText xml:space="preserve"> PAGEREF _Toc242212655 \h </w:instrText>
             </w:r>
             <w:r>
               <w:rPr>
@@ -1251,7 +1251,7 @@
               <w14:ligatures w14:val="standardContextual"/>
             </w:rPr>
           </w:pPr>
-          <w:hyperlink w:anchor="_Toc242211668" w:history="1">
+          <w:hyperlink w:anchor="_Toc242212656" w:history="1">
             <w:r>
               <w:rPr>
                 <w:rStyle w:val="Hyperlink"/>
@@ -1275,7 +1275,7 @@
               <w:rPr>
                 <w:noProof/>
               </w:rPr>
-              <w:instrText xml:space="preserve"> PAGEREF _Toc242211668 \h </w:instrText>
+              <w:instrText xml:space="preserve"> PAGEREF _Toc242212656 \h </w:instrText>
             </w:r>
             <w:r>
               <w:rPr>
@@ -1318,7 +1318,7 @@
               <w14:ligatures w14:val="standardContextual"/>
             </w:rPr>
           </w:pPr>
-          <w:hyperlink w:anchor="_Toc242211669" w:history="1">
+          <w:hyperlink w:anchor="_Toc242212657" w:history="1">
             <w:r>
               <w:rPr>
                 <w:rStyle w:val="Hyperlink"/>
@@ -1342,7 +1342,7 @@
               <w:rPr>
                 <w:noProof/>
               </w:rPr>
-              <w:instrText xml:space="preserve"> PAGEREF _Toc242211669 \h </w:instrText>
+              <w:instrText xml:space="preserve"> PAGEREF _Toc242212657 \h </w:instrText>
             </w:r>
             <w:r>
               <w:rPr>
@@ -1385,7 +1385,7 @@
               <w14:ligatures w14:val="standardContextual"/>
             </w:rPr>
           </w:pPr>
-          <w:hyperlink w:anchor="_Toc242211670" w:history="1">
+          <w:hyperlink w:anchor="_Toc242212658" w:history="1">
             <w:r>
               <w:rPr>
                 <w:rStyle w:val="Hyperlink"/>
@@ -1409,7 +1409,7 @@
               <w:rPr>
                 <w:noProof/>
               </w:rPr>
-              <w:instrText xml:space="preserve"> PAGEREF _Toc242211670 \h </w:instrText>
+              <w:instrText xml:space="preserve"> PAGEREF _Toc242212658 \h </w:instrText>
             </w:r>
             <w:r>
               <w:rPr>
@@ -1452,7 +1452,7 @@
               <w14:ligatures w14:val="standardContextual"/>
             </w:rPr>
           </w:pPr>
-          <w:hyperlink w:anchor="_Toc242211671" w:history="1">
+          <w:hyperlink w:anchor="_Toc242212659" w:history="1">
             <w:r>
               <w:rPr>
                 <w:rStyle w:val="Hyperlink"/>
@@ -1476,7 +1476,7 @@
               <w:rPr>
                 <w:noProof/>
               </w:rPr>
-              <w:instrText xml:space="preserve"> PAGEREF _Toc242211671 \h </w:instrText>
+              <w:instrText xml:space="preserve"> PAGEREF _Toc242212659 \h </w:instrText>
             </w:r>
             <w:r>
               <w:rPr>
@@ -1519,7 +1519,7 @@
               <w14:ligatures w14:val="standardContextual"/>
             </w:rPr>
           </w:pPr>
-          <w:hyperlink w:anchor="_Toc242211672" w:history="1">
+          <w:hyperlink w:anchor="_Toc242212660" w:history="1">
             <w:r>
               <w:rPr>
                 <w:rStyle w:val="Hyperlink"/>
@@ -1543,7 +1543,7 @@
               <w:rPr>
                 <w:noProof/>
               </w:rPr>
-              <w:instrText xml:space="preserve"> PAGEREF _Toc242211672 \h </w:instrText>
+              <w:instrText xml:space="preserve"> PAGEREF _Toc242212660 \h </w:instrText>
             </w:r>
             <w:r>
               <w:rPr>
@@ -1586,7 +1586,7 @@
               <w14:ligatures w14:val="standardContextual"/>
             </w:rPr>
           </w:pPr>
-          <w:hyperlink w:anchor="_Toc242211673" w:history="1">
+          <w:hyperlink w:anchor="_Toc242212661" w:history="1">
             <w:r>
               <w:rPr>
                 <w:rStyle w:val="Hyperlink"/>
@@ -1610,7 +1610,7 @@
               <w:rPr>
                 <w:noProof/>
               </w:rPr>
-              <w:instrText xml:space="preserve"> PAGEREF _Toc242211673 \h </w:instrText>
+              <w:instrText xml:space="preserve"> PAGEREF _Toc242212661 \h </w:instrText>
             </w:r>
             <w:r>
               <w:rPr>
@@ -1653,7 +1653,7 @@
               <w14:ligatures w14:val="standardContextual"/>
             </w:rPr>
           </w:pPr>
-          <w:hyperlink w:anchor="_Toc242211674" w:history="1">
+          <w:hyperlink w:anchor="_Toc242212662" w:history="1">
             <w:r>
               <w:rPr>
                 <w:rStyle w:val="Hyperlink"/>
@@ -1677,7 +1677,7 @@
               <w:rPr>
                 <w:noProof/>
               </w:rPr>
-              <w:instrText xml:space="preserve"> PAGEREF _Toc242211674 \h </w:instrText>
+              <w:instrText xml:space="preserve"> PAGEREF _Toc242212662 \h </w:instrText>
             </w:r>
             <w:r>
               <w:rPr>
@@ -1720,7 +1720,7 @@
               <w14:ligatures w14:val="standardContextual"/>
             </w:rPr>
           </w:pPr>
-          <w:hyperlink w:anchor="_Toc242211675" w:history="1">
+          <w:hyperlink w:anchor="_Toc242212663" w:history="1">
             <w:r>
               <w:rPr>
                 <w:rStyle w:val="Hyperlink"/>
@@ -1744,7 +1744,7 @@
               <w:rPr>
                 <w:noProof/>
               </w:rPr>
-              <w:instrText xml:space="preserve"> PAGEREF _Toc242211675 \h </w:instrText>
+              <w:instrText xml:space="preserve"> PAGEREF _Toc242212663 \h </w:instrText>
             </w:r>
             <w:r>
               <w:rPr>
@@ -1787,7 +1787,7 @@
               <w14:ligatures w14:val="standardContextual"/>
             </w:rPr>
           </w:pPr>
-          <w:hyperlink w:anchor="_Toc242211676" w:history="1">
+          <w:hyperlink w:anchor="_Toc242212664" w:history="1">
             <w:r>
               <w:rPr>
                 <w:rStyle w:val="Hyperlink"/>
@@ -1811,7 +1811,7 @@
               <w:rPr>
                 <w:noProof/>
               </w:rPr>
-              <w:instrText xml:space="preserve"> PAGEREF _Toc242211676 \h </w:instrText>
+              <w:instrText xml:space="preserve"> PAGEREF _Toc242212664 \h </w:instrText>
             </w:r>
             <w:r>
               <w:rPr>
@@ -1854,7 +1854,7 @@
               <w14:ligatures w14:val="standardContextual"/>
             </w:rPr>
           </w:pPr>
-          <w:hyperlink w:anchor="_Toc242211677" w:history="1">
+          <w:hyperlink w:anchor="_Toc242212665" w:history="1">
             <w:r>
               <w:rPr>
                 <w:rStyle w:val="Hyperlink"/>
@@ -1878,7 +1878,7 @@
               <w:rPr>
                 <w:noProof/>
               </w:rPr>
-              <w:instrText xml:space="preserve"> PAGEREF _Toc242211677 \h </w:instrText>
+              <w:instrText xml:space="preserve"> PAGEREF _Toc242212665 \h </w:instrText>
             </w:r>
             <w:r>
               <w:rPr>
@@ -1921,7 +1921,7 @@
               <w14:ligatures w14:val="standardContextual"/>
             </w:rPr>
           </w:pPr>
-          <w:hyperlink w:anchor="_Toc242211678" w:history="1">
+          <w:hyperlink w:anchor="_Toc242212666" w:history="1">
             <w:r>
               <w:rPr>
                 <w:rStyle w:val="Hyperlink"/>
@@ -1945,7 +1945,7 @@
               <w:rPr>
                 <w:noProof/>
               </w:rPr>
-              <w:instrText xml:space="preserve"> PAGEREF _Toc242211678 \h </w:instrText>
+              <w:instrText xml:space="preserve"> PAGEREF _Toc242212666 \h </w:instrText>
             </w:r>
             <w:r>
               <w:rPr>
@@ -1988,7 +1988,7 @@
               <w14:ligatures w14:val="standardContextual"/>
             </w:rPr>
           </w:pPr>
-          <w:hyperlink w:anchor="_Toc242211679" w:history="1">
+          <w:hyperlink w:anchor="_Toc242212667" w:history="1">
             <w:r>
               <w:rPr>
                 <w:rStyle w:val="Hyperlink"/>
@@ -2012,7 +2012,7 @@
               <w:rPr>
                 <w:noProof/>
               </w:rPr>
-              <w:instrText xml:space="preserve"> PAGEREF _Toc242211679 \h </w:instrText>
+              <w:instrText xml:space="preserve"> PAGEREF _Toc242212667 \h </w:instrText>
             </w:r>
             <w:r>
               <w:rPr>
@@ -2055,7 +2055,7 @@
               <w14:ligatures w14:val="standardContextual"/>
             </w:rPr>
           </w:pPr>
-          <w:hyperlink w:anchor="_Toc242211680" w:history="1">
+          <w:hyperlink w:anchor="_Toc242212668" w:history="1">
             <w:r>
               <w:rPr>
                 <w:rStyle w:val="Hyperlink"/>
@@ -2079,7 +2079,7 @@
               <w:rPr>
                 <w:noProof/>
               </w:rPr>
-              <w:instrText xml:space="preserve"> PAGEREF _Toc242211680 \h </w:instrText>
+              <w:instrText xml:space="preserve"> PAGEREF _Toc242212668 \h </w:instrText>
             </w:r>
             <w:r>
               <w:rPr>
@@ -2122,7 +2122,7 @@
               <w14:ligatures w14:val="standardContextual"/>
             </w:rPr>
           </w:pPr>
-          <w:hyperlink w:anchor="_Toc242211681" w:history="1">
+          <w:hyperlink w:anchor="_Toc242212669" w:history="1">
             <w:r>
               <w:rPr>
                 <w:rStyle w:val="Hyperlink"/>
@@ -2146,7 +2146,7 @@
               <w:rPr>
                 <w:noProof/>
               </w:rPr>
-              <w:instrText xml:space="preserve"> PAGEREF _Toc242211681 \h </w:instrText>
+              <w:instrText xml:space="preserve"> PAGEREF _Toc242212669 \h </w:instrText>
             </w:r>
             <w:r>
               <w:rPr>
@@ -2189,7 +2189,7 @@
               <w14:ligatures w14:val="standardContextual"/>
             </w:rPr>
           </w:pPr>
-          <w:hyperlink w:anchor="_Toc242211682" w:history="1">
+          <w:hyperlink w:anchor="_Toc242212670" w:history="1">
             <w:r>
               <w:rPr>
                 <w:rStyle w:val="Hyperlink"/>
@@ -2213,7 +2213,7 @@
               <w:rPr>
                 <w:noProof/>
               </w:rPr>
-              <w:instrText xml:space="preserve"> PAGEREF _Toc242211682 \h </w:instrText>
+              <w:instrText xml:space="preserve"> PAGEREF _Toc242212670 \h </w:instrText>
             </w:r>
             <w:r>
               <w:rPr>
@@ -2256,7 +2256,7 @@
               <w14:ligatures w14:val="standardContextual"/>
             </w:rPr>
           </w:pPr>
-          <w:hyperlink w:anchor="_Toc242211683" w:history="1">
+          <w:hyperlink w:anchor="_Toc242212671" w:history="1">
             <w:r>
               <w:rPr>
                 <w:rStyle w:val="Hyperlink"/>
@@ -2280,7 +2280,7 @@
               <w:rPr>
                 <w:noProof/>
               </w:rPr>
-              <w:instrText xml:space="preserve"> PAGEREF _Toc242211683 \h </w:instrText>
+              <w:instrText xml:space="preserve"> PAGEREF _Toc242212671 \h </w:instrText>
             </w:r>
             <w:r>
               <w:rPr>
@@ -2323,7 +2323,7 @@
               <w14:ligatures w14:val="standardContextual"/>
             </w:rPr>
           </w:pPr>
-          <w:hyperlink w:anchor="_Toc242211684" w:history="1">
+          <w:hyperlink w:anchor="_Toc242212672" w:history="1">
             <w:r>
               <w:rPr>
                 <w:rStyle w:val="Hyperlink"/>
@@ -2347,7 +2347,7 @@
               <w:rPr>
                 <w:noProof/>
               </w:rPr>
-              <w:instrText xml:space="preserve"> PAGEREF _Toc242211684 \h </w:instrText>
+              <w:instrText xml:space="preserve"> PAGEREF _Toc242212672 \h </w:instrText>
             </w:r>
             <w:r>
               <w:rPr>
@@ -2390,7 +2390,7 @@
               <w14:ligatures w14:val="standardContextual"/>
             </w:rPr>
           </w:pPr>
-          <w:hyperlink w:anchor="_Toc242211685" w:history="1">
+          <w:hyperlink w:anchor="_Toc242212673" w:history="1">
             <w:r>
               <w:rPr>
                 <w:rStyle w:val="Hyperlink"/>
@@ -2414,7 +2414,7 @@
               <w:rPr>
                 <w:noProof/>
               </w:rPr>
-              <w:instrText xml:space="preserve"> PAGEREF _Toc242211685 \h </w:instrText>
+              <w:instrText xml:space="preserve"> PAGEREF _Toc242212673 \h </w:instrText>
             </w:r>
             <w:r>
               <w:rPr>
@@ -2457,7 +2457,7 @@
               <w14:ligatures w14:val="standardContextual"/>
             </w:rPr>
           </w:pPr>
-          <w:hyperlink w:anchor="_Toc242211686" w:history="1">
+          <w:hyperlink w:anchor="_Toc242212674" w:history="1">
             <w:r>
               <w:rPr>
                 <w:rStyle w:val="Hyperlink"/>
@@ -2481,7 +2481,7 @@
               <w:rPr>
                 <w:noProof/>
               </w:rPr>
-              <w:instrText xml:space="preserve"> PAGEREF _Toc242211686 \h </w:instrText>
+              <w:instrText xml:space="preserve"> PAGEREF _Toc242212674 \h </w:instrText>
             </w:r>
             <w:r>
               <w:rPr>
@@ -2524,7 +2524,7 @@
               <w14:ligatures w14:val="standardContextual"/>
             </w:rPr>
           </w:pPr>
-          <w:hyperlink w:anchor="_Toc242211687" w:history="1">
+          <w:hyperlink w:anchor="_Toc242212675" w:history="1">
             <w:r>
               <w:rPr>
                 <w:rStyle w:val="Hyperlink"/>
@@ -2548,7 +2548,7 @@
               <w:rPr>
                 <w:noProof/>
               </w:rPr>
-              <w:instrText xml:space="preserve"> PAGEREF _Toc242211687 \h </w:instrText>
+              <w:instrText xml:space="preserve"> PAGEREF _Toc242212675 \h </w:instrText>
             </w:r>
             <w:r>
               <w:rPr>
@@ -2591,7 +2591,7 @@
               <w14:ligatures w14:val="standardContextual"/>
             </w:rPr>
           </w:pPr>
-          <w:hyperlink w:anchor="_Toc242211688" w:history="1">
+          <w:hyperlink w:anchor="_Toc242212676" w:history="1">
             <w:r>
               <w:rPr>
                 <w:rStyle w:val="Hyperlink"/>
@@ -2615,7 +2615,7 @@
               <w:rPr>
                 <w:noProof/>
               </w:rPr>
-              <w:instrText xml:space="preserve"> PAGEREF _Toc242211688 \h </w:instrText>
+              <w:instrText xml:space="preserve"> PAGEREF _Toc242212676 \h </w:instrText>
             </w:r>
             <w:r>
               <w:rPr>
@@ -2658,7 +2658,7 @@
               <w14:ligatures w14:val="standardContextual"/>
             </w:rPr>
           </w:pPr>
-          <w:hyperlink w:anchor="_Toc242211689" w:history="1">
+          <w:hyperlink w:anchor="_Toc242212677" w:history="1">
             <w:r>
               <w:rPr>
                 <w:rStyle w:val="Hyperlink"/>
@@ -2682,7 +2682,7 @@
               <w:rPr>
                 <w:noProof/>
               </w:rPr>
-              <w:instrText xml:space="preserve"> PAGEREF _Toc242211689 \h </w:instrText>
+              <w:instrText xml:space="preserve"> PAGEREF _Toc242212677 \h </w:instrText>
             </w:r>
             <w:r>
               <w:rPr>
@@ -2725,7 +2725,7 @@
               <w14:ligatures w14:val="standardContextual"/>
             </w:rPr>
           </w:pPr>
-          <w:hyperlink w:anchor="_Toc242211690" w:history="1">
+          <w:hyperlink w:anchor="_Toc242212678" w:history="1">
             <w:r>
               <w:rPr>
                 <w:rStyle w:val="Hyperlink"/>
@@ -2749,7 +2749,7 @@
               <w:rPr>
                 <w:noProof/>
               </w:rPr>
-              <w:instrText xml:space="preserve"> PAGEREF _Toc242211690 \h </w:instrText>
+              <w:instrText xml:space="preserve"> PAGEREF _Toc242212678 \h </w:instrText>
             </w:r>
             <w:r>
               <w:rPr>
@@ -2792,7 +2792,7 @@
               <w14:ligatures w14:val="standardContextual"/>
             </w:rPr>
           </w:pPr>
-          <w:hyperlink w:anchor="_Toc242211691" w:history="1">
+          <w:hyperlink w:anchor="_Toc242212679" w:history="1">
             <w:r>
               <w:rPr>
                 <w:rStyle w:val="Hyperlink"/>
@@ -2816,7 +2816,7 @@
               <w:rPr>
                 <w:noProof/>
               </w:rPr>
-              <w:instrText xml:space="preserve"> PAGEREF _Toc242211691 \h </w:instrText>
+              <w:instrText xml:space="preserve"> PAGEREF _Toc242212679 \h </w:instrText>
             </w:r>
             <w:r>
               <w:rPr>
@@ -2859,7 +2859,7 @@
               <w14:ligatures w14:val="standardContextual"/>
             </w:rPr>
           </w:pPr>
-          <w:hyperlink w:anchor="_Toc242211692" w:history="1">
+          <w:hyperlink w:anchor="_Toc242212680" w:history="1">
             <w:r>
               <w:rPr>
                 <w:rStyle w:val="Hyperlink"/>
@@ -2883,7 +2883,7 @@
               <w:rPr>
                 <w:noProof/>
               </w:rPr>
-              <w:instrText xml:space="preserve"> PAGEREF _Toc242211692 \h </w:instrText>
+              <w:instrText xml:space="preserve"> PAGEREF _Toc242212680 \h </w:instrText>
             </w:r>
             <w:r>
               <w:rPr>
@@ -2926,7 +2926,7 @@
               <w14:ligatures w14:val="standardContextual"/>
             </w:rPr>
           </w:pPr>
-          <w:hyperlink w:anchor="_Toc242211693" w:history="1">
+          <w:hyperlink w:anchor="_Toc242212681" w:history="1">
             <w:r>
               <w:rPr>
                 <w:rStyle w:val="Hyperlink"/>
@@ -2950,7 +2950,7 @@
               <w:rPr>
                 <w:noProof/>
               </w:rPr>
-              <w:instrText xml:space="preserve"> PAGEREF _Toc242211693 \h </w:instrText>
+              <w:instrText xml:space="preserve"> PAGEREF _Toc242212681 \h </w:instrText>
             </w:r>
             <w:r>
               <w:rPr>
@@ -2993,7 +2993,7 @@
               <w14:ligatures w14:val="standardContextual"/>
             </w:rPr>
           </w:pPr>
-          <w:hyperlink w:anchor="_Toc242211694" w:history="1">
+          <w:hyperlink w:anchor="_Toc242212682" w:history="1">
             <w:r>
               <w:rPr>
                 <w:rStyle w:val="Hyperlink"/>
@@ -3017,7 +3017,7 @@
               <w:rPr>
                 <w:noProof/>
               </w:rPr>
-              <w:instrText xml:space="preserve"> PAGEREF _Toc242211694 \h </w:instrText>
+              <w:instrText xml:space="preserve"> PAGEREF _Toc242212682 \h </w:instrText>
             </w:r>
             <w:r>
               <w:rPr>
@@ -3060,7 +3060,7 @@
               <w14:ligatures w14:val="standardContextual"/>
             </w:rPr>
           </w:pPr>
-          <w:hyperlink w:anchor="_Toc242211695" w:history="1">
+          <w:hyperlink w:anchor="_Toc242212683" w:history="1">
             <w:r>
               <w:rPr>
                 <w:rStyle w:val="Hyperlink"/>
@@ -3084,7 +3084,7 @@
               <w:rPr>
                 <w:noProof/>
               </w:rPr>
-              <w:instrText xml:space="preserve"> PAGEREF _Toc242211695 \h </w:instrText>
+              <w:instrText xml:space="preserve"> PAGEREF _Toc242212683 \h </w:instrText>
             </w:r>
             <w:r>
               <w:rPr>
@@ -3127,7 +3127,7 @@
       <w:pPr>
         <w:pStyle w:val="Heading1"/>
       </w:pPr>
-      <w:bookmarkStart w:id="0" w:name="_Toc242211655"/>
+      <w:bookmarkStart w:id="0" w:name="_Toc242212643"/>
       <w:r>
         <w:lastRenderedPageBreak/>
         <w:t>Introduction</w:t>
@@ -3186,7 +3186,7 @@
       <w:pPr>
         <w:pStyle w:val="Heading1"/>
       </w:pPr>
-      <w:bookmarkStart w:id="1" w:name="_Toc242211656"/>
+      <w:bookmarkStart w:id="1" w:name="_Toc242212644"/>
       <w:r>
         <w:t>Task 1: Modelling Strategy and Implementation</w:t>
       </w:r>
@@ -3208,7 +3208,7 @@
       <w:pPr>
         <w:pStyle w:val="Heading2"/>
       </w:pPr>
-      <w:bookmarkStart w:id="2" w:name="_Toc242211657"/>
+      <w:bookmarkStart w:id="2" w:name="_Toc242212645"/>
       <w:r>
         <w:t>1.1 Analytical question and task type</w:t>
       </w:r>
@@ -3252,7 +3252,7 @@
       <w:pPr>
         <w:pStyle w:val="Heading2"/>
       </w:pPr>
-      <w:bookmarkStart w:id="3" w:name="_Toc242211658"/>
+      <w:bookmarkStart w:id="3" w:name="_Toc242212646"/>
       <w:r>
         <w:t>1.2 Data, split and predictors</w:t>
       </w:r>
@@ -4259,7 +4259,7 @@
       <w:pPr>
         <w:pStyle w:val="Heading2"/>
       </w:pPr>
-      <w:bookmarkStart w:id="4" w:name="_Toc242211659"/>
+      <w:bookmarkStart w:id="4" w:name="_Toc242212647"/>
       <w:r>
         <w:t>1.3 Leakage control</w:t>
       </w:r>
@@ -4286,7 +4286,7 @@
       <w:pPr>
         <w:pStyle w:val="Heading2"/>
       </w:pPr>
-      <w:bookmarkStart w:id="5" w:name="_Toc242211660"/>
+      <w:bookmarkStart w:id="5" w:name="_Toc242212648"/>
       <w:r>
         <w:t>1.4 Candidate techniques and assumptions</w:t>
       </w:r>
@@ -4703,7 +4703,7 @@
       <w:pPr>
         <w:pStyle w:val="Heading2"/>
       </w:pPr>
-      <w:bookmarkStart w:id="6" w:name="_Toc242211661"/>
+      <w:bookmarkStart w:id="6" w:name="_Toc242212649"/>
       <w:r>
         <w:t>1.5 Preprocessing recipes</w:t>
       </w:r>
@@ -4733,7 +4733,7 @@
       <w:pPr>
         <w:pStyle w:val="Heading2"/>
       </w:pPr>
-      <w:bookmarkStart w:id="7" w:name="_Toc242211662"/>
+      <w:bookmarkStart w:id="7" w:name="_Toc242212650"/>
       <w:r>
         <w:t>1.6 Resampling, class imbalance and tuning</w:t>
       </w:r>
@@ -6020,7 +6020,7 @@
       <w:pPr>
         <w:pStyle w:val="Heading2"/>
       </w:pPr>
-      <w:bookmarkStart w:id="8" w:name="_Toc242211663"/>
+      <w:bookmarkStart w:id="8" w:name="_Toc242212651"/>
       <w:r>
         <w:t>1.7 Final models</w:t>
       </w:r>
@@ -6852,7 +6852,7 @@
       <w:pPr>
         <w:pStyle w:val="Heading2"/>
       </w:pPr>
-      <w:bookmarkStart w:id="9" w:name="_Toc242211664"/>
+      <w:bookmarkStart w:id="9" w:name="_Toc242212652"/>
       <w:r>
         <w:t>1.8 Binary screening model</w:t>
       </w:r>
@@ -6888,7 +6888,7 @@
       <w:pPr>
         <w:pStyle w:val="Heading2"/>
       </w:pPr>
-      <w:bookmarkStart w:id="10" w:name="_Toc242211665"/>
+      <w:bookmarkStart w:id="10" w:name="_Toc242212653"/>
       <w:r>
         <w:t>1.9 Hand-offs and reproducibility</w:t>
       </w:r>
@@ -6979,7 +6979,7 @@
       <w:pPr>
         <w:pStyle w:val="Heading1"/>
       </w:pPr>
-      <w:bookmarkStart w:id="11" w:name="_Toc242211666"/>
+      <w:bookmarkStart w:id="11" w:name="_Toc242212654"/>
       <w:r>
         <w:lastRenderedPageBreak/>
         <w:t>Task 2: Technical Model Evaluation and Comparison</w:t>
@@ -7002,7 +7002,7 @@
       <w:pPr>
         <w:pStyle w:val="Heading2"/>
       </w:pPr>
-      <w:bookmarkStart w:id="12" w:name="_Toc242211667"/>
+      <w:bookmarkStart w:id="12" w:name="_Toc242212655"/>
       <w:r>
         <w:t>2.1 Evaluation design</w:t>
       </w:r>
@@ -7484,7 +7484,7 @@
       <w:pPr>
         <w:pStyle w:val="Heading2"/>
       </w:pPr>
-      <w:bookmarkStart w:id="13" w:name="_Toc242211668"/>
+      <w:bookmarkStart w:id="13" w:name="_Toc242212656"/>
       <w:r>
         <w:lastRenderedPageBreak/>
         <w:t>2.2 Three-tier results</w:t>
@@ -8756,7 +8756,7 @@
           <w:noProof/>
         </w:rPr>
         <w:drawing>
-          <wp:inline distT="0" distB="0" distL="0" distR="0" wp14:anchorId="6152042E" wp14:editId="22773AF2">
+          <wp:inline distT="0" distB="0" distL="0" distR="0" wp14:anchorId="7C009153" wp14:editId="3CD426CC">
             <wp:extent cx="5715000" cy="2857500"/>
             <wp:effectExtent l="0" t="0" r="0" b="0"/>
             <wp:docPr id="1" name="Picture 1"/>
@@ -8811,7 +8811,7 @@
       <w:pPr>
         <w:pStyle w:val="Heading2"/>
       </w:pPr>
-      <w:bookmarkStart w:id="14" w:name="_Toc242211669"/>
+      <w:bookmarkStart w:id="14" w:name="_Toc242212657"/>
       <w:r>
         <w:lastRenderedPageBreak/>
         <w:t>2.3 Screening performance and decision threshold</w:t>
@@ -10195,7 +10195,7 @@
         </w:rPr>
         <w:lastRenderedPageBreak/>
         <w:drawing>
-          <wp:inline distT="0" distB="0" distL="0" distR="0" wp14:anchorId="531D0E69" wp14:editId="1CBEAA56">
+          <wp:inline distT="0" distB="0" distL="0" distR="0" wp14:anchorId="31E12D83" wp14:editId="269BC66B">
             <wp:extent cx="5715000" cy="3219450"/>
             <wp:effectExtent l="0" t="0" r="0" b="0"/>
             <wp:docPr id="2" name="Picture 2"/>
@@ -10250,7 +10250,7 @@
       <w:pPr>
         <w:pStyle w:val="Heading2"/>
       </w:pPr>
-      <w:bookmarkStart w:id="15" w:name="_Toc242211670"/>
+      <w:bookmarkStart w:id="15" w:name="_Toc242212658"/>
       <w:r>
         <w:t>2.4 Calibration</w:t>
       </w:r>
@@ -10274,7 +10274,7 @@
           <w:noProof/>
         </w:rPr>
         <w:drawing>
-          <wp:inline distT="0" distB="0" distL="0" distR="0" wp14:anchorId="59997710" wp14:editId="6F798823">
+          <wp:inline distT="0" distB="0" distL="0" distR="0" wp14:anchorId="4117C9D1" wp14:editId="48A633B0">
             <wp:extent cx="5715000" cy="2857500"/>
             <wp:effectExtent l="0" t="0" r="0" b="0"/>
             <wp:docPr id="3" name="Picture 3"/>
@@ -10329,7 +10329,7 @@
       <w:pPr>
         <w:pStyle w:val="Heading2"/>
       </w:pPr>
-      <w:bookmarkStart w:id="16" w:name="_Toc242211671"/>
+      <w:bookmarkStart w:id="16" w:name="_Toc242212659"/>
       <w:r>
         <w:lastRenderedPageBreak/>
         <w:t>2.5 Generalisation, overfitting and uncertainty</w:t>
@@ -11146,7 +11146,7 @@
       <w:pPr>
         <w:pStyle w:val="Heading2"/>
       </w:pPr>
-      <w:bookmarkStart w:id="17" w:name="_Toc242211672"/>
+      <w:bookmarkStart w:id="17" w:name="_Toc242212660"/>
       <w:r>
         <w:t>2.6 Evaluation matrix and final model selection</w:t>
       </w:r>
@@ -14277,7 +14277,7 @@
       <w:pPr>
         <w:pStyle w:val="Heading1"/>
       </w:pPr>
-      <w:bookmarkStart w:id="18" w:name="_Toc242211673"/>
+      <w:bookmarkStart w:id="18" w:name="_Toc242212661"/>
       <w:r>
         <w:lastRenderedPageBreak/>
         <w:t>Task 3: Interpretation and Business Evaluation</w:t>
@@ -14300,7 +14300,7 @@
       <w:pPr>
         <w:pStyle w:val="Heading2"/>
       </w:pPr>
-      <w:bookmarkStart w:id="19" w:name="_Toc242211674"/>
+      <w:bookmarkStart w:id="19" w:name="_Toc242212662"/>
       <w:r>
         <w:t>3.1 What drives the predictions</w:t>
       </w:r>
@@ -15286,7 +15286,7 @@
         </w:rPr>
         <w:lastRenderedPageBreak/>
         <w:drawing>
-          <wp:inline distT="0" distB="0" distL="0" distR="0" wp14:anchorId="24689310" wp14:editId="5ADE9976">
+          <wp:inline distT="0" distB="0" distL="0" distR="0" wp14:anchorId="2B19BBD5" wp14:editId="1547AC81">
             <wp:extent cx="5715000" cy="4286250"/>
             <wp:effectExtent l="0" t="0" r="0" b="0"/>
             <wp:docPr id="4" name="Picture 4"/>
@@ -15341,7 +15341,7 @@
       <w:pPr>
         <w:pStyle w:val="Heading2"/>
       </w:pPr>
-      <w:bookmarkStart w:id="20" w:name="_Toc242211675"/>
+      <w:bookmarkStart w:id="20" w:name="_Toc242212663"/>
       <w:r>
         <w:t>3.2 Hypotheses H1–H6</w:t>
       </w:r>
@@ -15945,7 +15945,7 @@
       <w:pPr>
         <w:pStyle w:val="Heading2"/>
       </w:pPr>
-      <w:bookmarkStart w:id="21" w:name="_Toc242211676"/>
+      <w:bookmarkStart w:id="21" w:name="_Toc242212664"/>
       <w:r>
         <w:t>3.3 Business objectives and success criteria</w:t>
       </w:r>
@@ -16320,7 +16320,7 @@
       <w:pPr>
         <w:pStyle w:val="Heading2"/>
       </w:pPr>
-      <w:bookmarkStart w:id="22" w:name="_Toc242211677"/>
+      <w:bookmarkStart w:id="22" w:name="_Toc242212665"/>
       <w:r>
         <w:lastRenderedPageBreak/>
         <w:t>3.4 Performance across subgroups</w:t>
@@ -19235,7 +19235,7 @@
       <w:pPr>
         <w:pStyle w:val="Heading2"/>
       </w:pPr>
-      <w:bookmarkStart w:id="23" w:name="_Toc242211678"/>
+      <w:bookmarkStart w:id="23" w:name="_Toc242212666"/>
       <w:r>
         <w:t>3.5 Limitations</w:t>
       </w:r>
@@ -19352,7 +19352,7 @@
       <w:pPr>
         <w:pStyle w:val="Heading2"/>
       </w:pPr>
-      <w:bookmarkStart w:id="24" w:name="_Toc242211679"/>
+      <w:bookmarkStart w:id="24" w:name="_Toc242212667"/>
       <w:r>
         <w:t>3.6 Deployment recommendation</w:t>
       </w:r>
@@ -19457,7 +19457,7 @@
       <w:pPr>
         <w:pStyle w:val="Heading2"/>
       </w:pPr>
-      <w:bookmarkStart w:id="25" w:name="_Toc242211680"/>
+      <w:bookmarkStart w:id="25" w:name="_Toc242212668"/>
       <w:r>
         <w:lastRenderedPageBreak/>
         <w:t>3.7 Ethics, fairness and responsible AI</w:t>
@@ -23405,7 +23405,7 @@
       <w:pPr>
         <w:pStyle w:val="Heading1"/>
       </w:pPr>
-      <w:bookmarkStart w:id="26" w:name="_Toc242211681"/>
+      <w:bookmarkStart w:id="26" w:name="_Toc242212669"/>
       <w:r>
         <w:lastRenderedPageBreak/>
         <w:t>Task 4: Deployment and Monitoring Strategy</w:t>
@@ -23445,7 +23445,7 @@
       <w:pPr>
         <w:pStyle w:val="Heading2"/>
       </w:pPr>
-      <w:bookmarkStart w:id="27" w:name="_Toc242211682"/>
+      <w:bookmarkStart w:id="27" w:name="_Toc242212670"/>
       <w:r>
         <w:t>4.1 Deployment objective, users and conditions</w:t>
       </w:r>
@@ -24188,7 +24188,7 @@
       <w:pPr>
         <w:pStyle w:val="Heading2"/>
       </w:pPr>
-      <w:bookmarkStart w:id="28" w:name="_Toc242211683"/>
+      <w:bookmarkStart w:id="28" w:name="_Toc242212671"/>
       <w:r>
         <w:lastRenderedPageBreak/>
         <w:t>4.2 Deployment tool evaluation</w:t>
@@ -26186,7 +26186,7 @@
       <w:pPr>
         <w:pStyle w:val="Heading2"/>
       </w:pPr>
-      <w:bookmarkStart w:id="29" w:name="_Toc242211684"/>
+      <w:bookmarkStart w:id="29" w:name="_Toc242212672"/>
       <w:r>
         <w:t>4.3 The deployed component</w:t>
       </w:r>
@@ -26468,7 +26468,7 @@
         </w:rPr>
         <w:lastRenderedPageBreak/>
         <w:drawing>
-          <wp:inline distT="0" distB="0" distL="0" distR="0" wp14:anchorId="28B23D1A" wp14:editId="58DEE43D">
+          <wp:inline distT="0" distB="0" distL="0" distR="0" wp14:anchorId="79B18755" wp14:editId="2AA1CA1B">
             <wp:extent cx="4953000" cy="3629025"/>
             <wp:effectExtent l="0" t="0" r="0" b="0"/>
             <wp:docPr id="5" name="Picture 5"/>
@@ -26530,7 +26530,7 @@
         </w:rPr>
         <w:lastRenderedPageBreak/>
         <w:drawing>
-          <wp:inline distT="0" distB="0" distL="0" distR="0" wp14:anchorId="79E6D12C" wp14:editId="26F37D19">
+          <wp:inline distT="0" distB="0" distL="0" distR="0" wp14:anchorId="1BD33BF6" wp14:editId="11B01128">
             <wp:extent cx="5143500" cy="5648325"/>
             <wp:effectExtent l="0" t="0" r="0" b="0"/>
             <wp:docPr id="6" name="Picture 6"/>
@@ -26592,7 +26592,7 @@
         </w:rPr>
         <w:lastRenderedPageBreak/>
         <w:drawing>
-          <wp:inline distT="0" distB="0" distL="0" distR="0" wp14:anchorId="6612E226" wp14:editId="7D7AC33D">
+          <wp:inline distT="0" distB="0" distL="0" distR="0" wp14:anchorId="2A8ED545" wp14:editId="44987236">
             <wp:extent cx="5715000" cy="3762375"/>
             <wp:effectExtent l="0" t="0" r="0" b="0"/>
             <wp:docPr id="7" name="Picture 7"/>
@@ -26647,7 +26647,7 @@
       <w:pPr>
         <w:pStyle w:val="Heading2"/>
       </w:pPr>
-      <w:bookmarkStart w:id="30" w:name="_Toc242211685"/>
+      <w:bookmarkStart w:id="30" w:name="_Toc242212673"/>
       <w:r>
         <w:t>4.4 Path for new data: validate, clean, preprocess, score</w:t>
       </w:r>
@@ -27644,7 +27644,7 @@
       <w:pPr>
         <w:pStyle w:val="Heading2"/>
       </w:pPr>
-      <w:bookmarkStart w:id="31" w:name="_Toc242211686"/>
+      <w:bookmarkStart w:id="31" w:name="_Toc242212674"/>
       <w:r>
         <w:t>4.5 Operational workflow, roles and versions</w:t>
       </w:r>
@@ -27660,7 +27660,7 @@
           <w:noProof/>
         </w:rPr>
         <w:drawing>
-          <wp:inline distT="0" distB="0" distL="0" distR="0" wp14:anchorId="69A0E987" wp14:editId="5D2BCF4F">
+          <wp:inline distT="0" distB="0" distL="0" distR="0" wp14:anchorId="276259A9" wp14:editId="03166C49">
             <wp:extent cx="5715000" cy="3333750"/>
             <wp:effectExtent l="0" t="0" r="0" b="0"/>
             <wp:docPr id="8" name="Picture 8"/>
@@ -28190,7 +28190,7 @@
       <w:pPr>
         <w:pStyle w:val="Heading2"/>
       </w:pPr>
-      <w:bookmarkStart w:id="32" w:name="_Toc242211687"/>
+      <w:bookmarkStart w:id="32" w:name="_Toc242212675"/>
       <w:r>
         <w:t>4.6 Monitoring plan</w:t>
       </w:r>
@@ -29869,7 +29869,7 @@
       <w:pPr>
         <w:pStyle w:val="Heading2"/>
       </w:pPr>
-      <w:bookmarkStart w:id="33" w:name="_Toc242211688"/>
+      <w:bookmarkStart w:id="33" w:name="_Toc242212676"/>
       <w:r>
         <w:t>4.7 Retraining and retirement</w:t>
       </w:r>
@@ -29902,7 +29902,7 @@
       <w:pPr>
         <w:pStyle w:val="Heading2"/>
       </w:pPr>
-      <w:bookmarkStart w:id="34" w:name="_Toc242211689"/>
+      <w:bookmarkStart w:id="34" w:name="_Toc242212677"/>
       <w:r>
         <w:t>4.8 Repository and reproducibility</w:t>
       </w:r>
@@ -29961,7 +29961,7 @@
       <w:pPr>
         <w:pStyle w:val="Heading1"/>
       </w:pPr>
-      <w:bookmarkStart w:id="35" w:name="_Toc242211690"/>
+      <w:bookmarkStart w:id="35" w:name="_Toc242212678"/>
       <w:r>
         <w:lastRenderedPageBreak/>
         <w:t>Insights and Recommendations</w:t>
@@ -29980,7 +29980,7 @@
       <w:pPr>
         <w:pStyle w:val="Heading2"/>
       </w:pPr>
-      <w:bookmarkStart w:id="36" w:name="_Toc242211691"/>
+      <w:bookmarkStart w:id="36" w:name="_Toc242212679"/>
       <w:r>
         <w:t>Key insights</w:t>
       </w:r>
@@ -30115,7 +30115,7 @@
       <w:pPr>
         <w:pStyle w:val="Heading2"/>
       </w:pPr>
-      <w:bookmarkStart w:id="37" w:name="_Toc242211692"/>
+      <w:bookmarkStart w:id="37" w:name="_Toc242212680"/>
       <w:r>
         <w:t>Recommendations for the institute</w:t>
       </w:r>
@@ -30223,7 +30223,7 @@
       <w:pPr>
         <w:pStyle w:val="Heading1"/>
       </w:pPr>
-      <w:bookmarkStart w:id="38" w:name="_Toc242211693"/>
+      <w:bookmarkStart w:id="38" w:name="_Toc242212681"/>
       <w:r>
         <w:t>Conclusion</w:t>
       </w:r>
@@ -30247,7 +30247,7 @@
       <w:pPr>
         <w:pStyle w:val="Heading1"/>
       </w:pPr>
-      <w:bookmarkStart w:id="39" w:name="_Toc242211694"/>
+      <w:bookmarkStart w:id="39" w:name="_Toc242212682"/>
       <w:r>
         <w:t>Acknowledgement of AI Use</w:t>
       </w:r>
@@ -30264,18 +30264,24 @@
         <w:t>he draft of the deployment, monitoring and ethics sections, and the workflow diagram. All AI-assisted code was run and tested on the project data, and every reported number was checked against the notebooks' outputs. Rudi du Plessis (Tasks 2 and 3) used Claude (Anthropic) as a coding and writing assistant. It was used to plan the Person B tasks; to draft and debug R code in the evaluation notebook and helped draft the text of the Task 2 and Task 3 sections. The author reviewed and approved all analysis deci</w:t>
       </w:r>
       <w:r>
-        <w:t xml:space="preserve">sions, including the choice of metrics, the threshold rule and the final model. Every number, table and figure in these sections was generated by running the notebook on the team's data. The text was checked against those outputs before submission. Responsibility for the content rests with the author. [Alexander: add your own AI use </w:t>
+        <w:t xml:space="preserve">sions, including the choice of metrics, the threshold rule and the final model. Every number, table and figure in these sections was generated by running the notebook on the team's data. The text was checked against those outputs before submission. Responsibility for the content rests with the author. Alexander Solomon (Task 1) used </w:t>
       </w:r>
       <w:r>
         <w:lastRenderedPageBreak/>
-        <w:t>here, or state that none was used.] The group takes full responsibility for the submitted work. Each use is recorded in the group's Ethics and Responsible AI Usage Log.</w:t>
+        <w:t>Claude (Anthropic) as a coding and writing assistant. It was used to check the Milestone 3 work split against the verified Milestone 2 output; to explain tidymodels concepts and</w:t>
+      </w:r>
+      <w:r>
+        <w:t xml:space="preserve"> R error messages; to review the repository for what the deployment needed; to add the binary screening model to the modelling notebook; to simplify the notebook's explanatory text and set up the repository and renv; and to draft the Task 1 section of the report. Every figure was checked against the Milestone 2 dataset and his own R output, he ran and committed all code himself, and the choice of the final model was left to Person B's evaluation. The group takes full responsibility for the submitted work. E</w:t>
+      </w:r>
+      <w:r>
+        <w:t>ach use is recorded in the group's Ethics and Responsible AI Usage Log.</w:t>
       </w:r>
     </w:p>
     <w:p>
       <w:pPr>
         <w:pStyle w:val="Heading1"/>
       </w:pPr>
-      <w:bookmarkStart w:id="40" w:name="_Toc242211695"/>
+      <w:bookmarkStart w:id="40" w:name="_Toc242212683"/>
       <w:r>
         <w:t>References</w:t>
       </w:r>
@@ -30582,6 +30588,7 @@
         <w:ind w:left="400" w:hanging="400"/>
       </w:pPr>
       <w:r>
+        <w:lastRenderedPageBreak/>
         <w:t xml:space="preserve">Saito, T., &amp; Rehmsmeier, M. (2015). The precision-recall plot is more informative than the ROC plot when evaluating binary classifiers on imbalanced datasets. </w:t>
       </w:r>
       <w:r>
@@ -30639,7 +30646,6 @@
         <w:ind w:left="400" w:hanging="400"/>
       </w:pPr>
       <w:r>
-        <w:lastRenderedPageBreak/>
         <w:t xml:space="preserve">Therneau, T., &amp; Atkinson, B. (2026). </w:t>
       </w:r>
       <w:r>
@@ -30839,64 +30845,10 @@
 <file path=word/numbering.xml><?xml version="1.0" encoding="utf-8"?>
 <w:numbering xmlns:wpc="http://schemas.microsoft.com/office/word/2010/wordprocessingCanvas" xmlns:cx="http://schemas.microsoft.com/office/drawing/2014/chartex" xmlns:cx1="http://schemas.microsoft.com/office/drawing/2015/9/8/chartex" xmlns:cx2="http://schemas.microsoft.com/office/drawing/2015/10/21/chartex" xmlns:cx3="http://schemas.microsoft.com/office/drawing/2016/5/9/chartex" xmlns:cx4="http://schemas.microsoft.com/office/drawing/2016/5/10/chartex" xmlns:cx5="http://schemas.microsoft.com/office/drawing/2016/5/11/chartex" xmlns:cx6="http://schemas.microsoft.com/office/drawing/2016/5/12/chartex" xmlns:cx7="http://schemas.microsoft.com/office/drawing/2016/5/13/chartex" xmlns:cx8="http://schemas.microsoft.com/office/drawing/2016/5/14/chartex" xmlns:mc="http://schemas.openxmlformats.org/markup-compatibility/2006" xmlns:aink="http://schemas.microsoft.com/office/drawing/2016/ink" xmlns:am3d="http://schemas.microsoft.com/office/drawing/2017/model3d" xmlns:o="urn:schemas-microsoft-com:office:office" xmlns:oel="http://schemas.microsoft.com/office/2019/extlst" xmlns:r="http://schemas.openxmlformats.org/officeDocument/2006/relationships" xmlns:m="http://schemas.openxmlformats.org/officeDocument/2006/math" xmlns:v="urn:schemas-microsoft-com:vml" xmlns:wp14="http://schemas.microsoft.com/office/word/2010/wordprocessingDrawing" xmlns:wp="http://schemas.openxmlformats.org/drawingml/2006/wordprocessingDrawing" xmlns:w10="urn:schemas-microsoft-com:office:word" xmlns:w="http://schemas.openxmlformats.org/wordprocessingml/2006/main" xmlns:w14="http://schemas.microsoft.com/office/word/2010/wordml" xmlns:w15="http://schemas.microsoft.com/office/word/2012/wordml" xmlns:w16cex="http://schemas.microsoft.com/office/word/2018/wordml/cex" xmlns:w16cid="http://schemas.microsoft.com/office/word/2016/wordml/cid" xmlns:w16="http://schemas.microsoft.com/office/word/2018/wordml" xmlns:w16du="http://schemas.microsoft.com/office/word/2023/wordml/word16du" xmlns:w16sdtdh="http://schemas.microsoft.com/office/word/2020/wordml/sdtdatahash" xmlns:w16sdtfl="http://schemas.microsoft.com/office/word/2024/wordml/sdtformatlock" xmlns:w16se="http://schemas.microsoft.com/office/word/2015/wordml/symex" xmlns:wpg="http://schemas.microsoft.com/office/word/2010/wordprocessingGroup" xmlns:wpi="http://schemas.microsoft.com/office/word/2010/wordprocessingInk" xmlns:wne="http://schemas.microsoft.com/office/word/2006/wordml" xmlns:wps="http://schemas.microsoft.com/office/word/2010/wordprocessingShape" mc:Ignorable="w14 w15 w16se w16cid w16 w16cex w16sdtdh w16sdtfl w16du wp14">
   <w:abstractNum w:abstractNumId="0" w15:restartNumberingAfterBreak="0">
-    <w:nsid w:val="32FE0547"/>
+    <w:nsid w:val="07C95807"/>
     <w:multiLevelType w:val="hybridMultilevel"/>
-    <w:tmpl w:val="336AF408"/>
-    <w:lvl w:ilvl="0" w:tplc="7C48594C">
-      <w:start w:val="1"/>
-      <w:numFmt w:val="decimal"/>
-      <w:lvlText w:val="%1."/>
-      <w:lvlJc w:val="left"/>
-      <w:pPr>
-        <w:ind w:left="400" w:hanging="300"/>
-      </w:pPr>
-    </w:lvl>
-    <w:lvl w:ilvl="1" w:tplc="473E9E96">
-      <w:numFmt w:val="decimal"/>
-      <w:lvlText w:val=""/>
-      <w:lvlJc w:val="left"/>
-    </w:lvl>
-    <w:lvl w:ilvl="2" w:tplc="5B1242AE">
-      <w:numFmt w:val="decimal"/>
-      <w:lvlText w:val=""/>
-      <w:lvlJc w:val="left"/>
-    </w:lvl>
-    <w:lvl w:ilvl="3" w:tplc="65E69080">
-      <w:numFmt w:val="decimal"/>
-      <w:lvlText w:val=""/>
-      <w:lvlJc w:val="left"/>
-    </w:lvl>
-    <w:lvl w:ilvl="4" w:tplc="0BB20C3A">
-      <w:numFmt w:val="decimal"/>
-      <w:lvlText w:val=""/>
-      <w:lvlJc w:val="left"/>
-    </w:lvl>
-    <w:lvl w:ilvl="5" w:tplc="74069E96">
-      <w:numFmt w:val="decimal"/>
-      <w:lvlText w:val=""/>
-      <w:lvlJc w:val="left"/>
-    </w:lvl>
-    <w:lvl w:ilvl="6" w:tplc="60D41114">
-      <w:numFmt w:val="decimal"/>
-      <w:lvlText w:val=""/>
-      <w:lvlJc w:val="left"/>
-    </w:lvl>
-    <w:lvl w:ilvl="7" w:tplc="A4D60F16">
-      <w:numFmt w:val="decimal"/>
-      <w:lvlText w:val=""/>
-      <w:lvlJc w:val="left"/>
-    </w:lvl>
-    <w:lvl w:ilvl="8" w:tplc="0D68D290">
-      <w:numFmt w:val="decimal"/>
-      <w:lvlText w:val=""/>
-      <w:lvlJc w:val="left"/>
-    </w:lvl>
-  </w:abstractNum>
-  <w:abstractNum w:abstractNumId="1" w15:restartNumberingAfterBreak="0">
-    <w:nsid w:val="3D4A0BD9"/>
-    <w:multiLevelType w:val="hybridMultilevel"/>
-    <w:tmpl w:val="9252BD20"/>
-    <w:lvl w:ilvl="0" w:tplc="25FA620A" w:tentative="1">
+    <w:tmpl w:val="8DFC67C8"/>
+    <w:lvl w:ilvl="0" w:tplc="007C12B6" w:tentative="1">
       <w:start w:val="1"/>
       <w:numFmt w:val="bullet"/>
       <w:lvlText w:val="●"/>
@@ -30905,7 +30857,7 @@
         <w:ind w:left="720" w:hanging="360"/>
       </w:pPr>
     </w:lvl>
-    <w:lvl w:ilvl="1" w:tplc="9EA0D086" w:tentative="1">
+    <w:lvl w:ilvl="1" w:tplc="1102B9A6" w:tentative="1">
       <w:start w:val="1"/>
       <w:numFmt w:val="bullet"/>
       <w:lvlText w:val="○"/>
@@ -30914,7 +30866,7 @@
         <w:ind w:left="1440" w:hanging="360"/>
       </w:pPr>
     </w:lvl>
-    <w:lvl w:ilvl="2" w:tplc="36E43B70" w:tentative="1">
+    <w:lvl w:ilvl="2" w:tplc="8C8080E2" w:tentative="1">
       <w:start w:val="1"/>
       <w:numFmt w:val="bullet"/>
       <w:lvlText w:val="■"/>
@@ -30923,7 +30875,7 @@
         <w:ind w:left="2160" w:hanging="360"/>
       </w:pPr>
     </w:lvl>
-    <w:lvl w:ilvl="3" w:tplc="9570809E" w:tentative="1">
+    <w:lvl w:ilvl="3" w:tplc="076E3F76" w:tentative="1">
       <w:start w:val="1"/>
       <w:numFmt w:val="bullet"/>
       <w:lvlText w:val="●"/>
@@ -30932,7 +30884,7 @@
         <w:ind w:left="2880" w:hanging="360"/>
       </w:pPr>
     </w:lvl>
-    <w:lvl w:ilvl="4" w:tplc="8A80C9B0" w:tentative="1">
+    <w:lvl w:ilvl="4" w:tplc="1312E61A" w:tentative="1">
       <w:start w:val="1"/>
       <w:numFmt w:val="bullet"/>
       <w:lvlText w:val="○"/>
@@ -30941,7 +30893,7 @@
         <w:ind w:left="3600" w:hanging="360"/>
       </w:pPr>
     </w:lvl>
-    <w:lvl w:ilvl="5" w:tplc="F5F2E05A" w:tentative="1">
+    <w:lvl w:ilvl="5" w:tplc="F5741942" w:tentative="1">
       <w:start w:val="1"/>
       <w:numFmt w:val="bullet"/>
       <w:lvlText w:val="■"/>
@@ -30950,7 +30902,7 @@
         <w:ind w:left="4320" w:hanging="360"/>
       </w:pPr>
     </w:lvl>
-    <w:lvl w:ilvl="6" w:tplc="918084E4" w:tentative="1">
+    <w:lvl w:ilvl="6" w:tplc="5C32684A" w:tentative="1">
       <w:start w:val="1"/>
       <w:numFmt w:val="bullet"/>
       <w:lvlText w:val="●"/>
@@ -30959,7 +30911,7 @@
         <w:ind w:left="5040" w:hanging="360"/>
       </w:pPr>
     </w:lvl>
-    <w:lvl w:ilvl="7" w:tplc="BAC6B216" w:tentative="1">
+    <w:lvl w:ilvl="7" w:tplc="7E0E5C06" w:tentative="1">
       <w:start w:val="1"/>
       <w:numFmt w:val="bullet"/>
       <w:lvlText w:val="●"/>
@@ -30968,7 +30920,7 @@
         <w:ind w:left="5760" w:hanging="360"/>
       </w:pPr>
     </w:lvl>
-    <w:lvl w:ilvl="8" w:tplc="66EE11BC" w:tentative="1">
+    <w:lvl w:ilvl="8" w:tplc="CA20A950" w:tentative="1">
       <w:start w:val="1"/>
       <w:numFmt w:val="bullet"/>
       <w:lvlText w:val="●"/>
@@ -30978,11 +30930,65 @@
       </w:pPr>
     </w:lvl>
   </w:abstractNum>
+  <w:abstractNum w:abstractNumId="1" w15:restartNumberingAfterBreak="0">
+    <w:nsid w:val="40C33D92"/>
+    <w:multiLevelType w:val="hybridMultilevel"/>
+    <w:tmpl w:val="958A38D4"/>
+    <w:lvl w:ilvl="0" w:tplc="8CC25BAA">
+      <w:start w:val="1"/>
+      <w:numFmt w:val="decimal"/>
+      <w:lvlText w:val="%1."/>
+      <w:lvlJc w:val="left"/>
+      <w:pPr>
+        <w:ind w:left="400" w:hanging="300"/>
+      </w:pPr>
+    </w:lvl>
+    <w:lvl w:ilvl="1" w:tplc="0A0E1BA2">
+      <w:numFmt w:val="decimal"/>
+      <w:lvlText w:val=""/>
+      <w:lvlJc w:val="left"/>
+    </w:lvl>
+    <w:lvl w:ilvl="2" w:tplc="81E25FD4">
+      <w:numFmt w:val="decimal"/>
+      <w:lvlText w:val=""/>
+      <w:lvlJc w:val="left"/>
+    </w:lvl>
+    <w:lvl w:ilvl="3" w:tplc="D0DAFA12">
+      <w:numFmt w:val="decimal"/>
+      <w:lvlText w:val=""/>
+      <w:lvlJc w:val="left"/>
+    </w:lvl>
+    <w:lvl w:ilvl="4" w:tplc="2D60378A">
+      <w:numFmt w:val="decimal"/>
+      <w:lvlText w:val=""/>
+      <w:lvlJc w:val="left"/>
+    </w:lvl>
+    <w:lvl w:ilvl="5" w:tplc="322AF6EA">
+      <w:numFmt w:val="decimal"/>
+      <w:lvlText w:val=""/>
+      <w:lvlJc w:val="left"/>
+    </w:lvl>
+    <w:lvl w:ilvl="6" w:tplc="1FB0261C">
+      <w:numFmt w:val="decimal"/>
+      <w:lvlText w:val=""/>
+      <w:lvlJc w:val="left"/>
+    </w:lvl>
+    <w:lvl w:ilvl="7" w:tplc="7A5CA8C6">
+      <w:numFmt w:val="decimal"/>
+      <w:lvlText w:val=""/>
+      <w:lvlJc w:val="left"/>
+    </w:lvl>
+    <w:lvl w:ilvl="8" w:tplc="481476CC">
+      <w:numFmt w:val="decimal"/>
+      <w:lvlText w:val=""/>
+      <w:lvlJc w:val="left"/>
+    </w:lvl>
+  </w:abstractNum>
   <w:abstractNum w:abstractNumId="2" w15:restartNumberingAfterBreak="0">
-    <w:nsid w:val="4D125E35"/>
+    <w:nsid w:val="72795EFE"/>
     <w:multiLevelType w:val="hybridMultilevel"/>
-    <w:tmpl w:val="B6FECF26"/>
-    <w:lvl w:ilvl="0" w:tplc="782239E4">
+    <w:tmpl w:val="17A20932"/>
+    <w:lvl w:ilvl="0" w:tplc="423C85F4">
       <w:start w:val="1"/>
       <w:numFmt w:val="bullet"/>
       <w:lvlText w:val="•"/>
@@ -30991,7 +30997,7 @@
         <w:ind w:left="400" w:hanging="260"/>
       </w:pPr>
     </w:lvl>
-    <w:lvl w:ilvl="1" w:tplc="53F8DA98" w:tentative="1">
+    <w:lvl w:ilvl="1" w:tplc="6B088EA8" w:tentative="1">
       <w:start w:val="1"/>
       <w:numFmt w:val="bullet"/>
       <w:lvlText w:val="–"/>
@@ -31000,68 +31006,68 @@
         <w:ind w:left="800" w:hanging="260"/>
       </w:pPr>
     </w:lvl>
-    <w:lvl w:ilvl="2" w:tplc="B442C0FE">
+    <w:lvl w:ilvl="2" w:tplc="543AB8E0">
       <w:numFmt w:val="decimal"/>
       <w:lvlText w:val=""/>
       <w:lvlJc w:val="left"/>
     </w:lvl>
-    <w:lvl w:ilvl="3" w:tplc="75524B16">
+    <w:lvl w:ilvl="3" w:tplc="1346CB20">
       <w:numFmt w:val="decimal"/>
       <w:lvlText w:val=""/>
       <w:lvlJc w:val="left"/>
     </w:lvl>
-    <w:lvl w:ilvl="4" w:tplc="F780880A">
+    <w:lvl w:ilvl="4" w:tplc="25C441AE">
       <w:numFmt w:val="decimal"/>
       <w:lvlText w:val=""/>
       <w:lvlJc w:val="left"/>
     </w:lvl>
-    <w:lvl w:ilvl="5" w:tplc="5BA65494">
+    <w:lvl w:ilvl="5" w:tplc="44A607E0">
       <w:numFmt w:val="decimal"/>
       <w:lvlText w:val=""/>
       <w:lvlJc w:val="left"/>
     </w:lvl>
-    <w:lvl w:ilvl="6" w:tplc="378EBC9C">
+    <w:lvl w:ilvl="6" w:tplc="92A89FFC">
       <w:numFmt w:val="decimal"/>
       <w:lvlText w:val=""/>
       <w:lvlJc w:val="left"/>
     </w:lvl>
-    <w:lvl w:ilvl="7" w:tplc="63DA3A8E">
+    <w:lvl w:ilvl="7" w:tplc="16342308">
       <w:numFmt w:val="decimal"/>
       <w:lvlText w:val=""/>
       <w:lvlJc w:val="left"/>
     </w:lvl>
-    <w:lvl w:ilvl="8" w:tplc="DD00D7BE">
+    <w:lvl w:ilvl="8" w:tplc="30B85374">
       <w:numFmt w:val="decimal"/>
       <w:lvlText w:val=""/>
       <w:lvlJc w:val="left"/>
     </w:lvl>
   </w:abstractNum>
-  <w:num w:numId="1" w16cid:durableId="1876115191">
+  <w:num w:numId="1" w16cid:durableId="1898004462">
+    <w:abstractNumId w:val="0"/>
+    <w:lvlOverride w:ilvl="0">
+      <w:startOverride w:val="1"/>
+    </w:lvlOverride>
+  </w:num>
+  <w:num w:numId="2" w16cid:durableId="1902013092">
+    <w:abstractNumId w:val="2"/>
+    <w:lvlOverride w:ilvl="0">
+      <w:startOverride w:val="1"/>
+    </w:lvlOverride>
+  </w:num>
+  <w:num w:numId="3" w16cid:durableId="1939634877">
     <w:abstractNumId w:val="1"/>
     <w:lvlOverride w:ilvl="0">
       <w:startOverride w:val="1"/>
     </w:lvlOverride>
   </w:num>
-  <w:num w:numId="2" w16cid:durableId="494146384">
-    <w:abstractNumId w:val="2"/>
+  <w:num w:numId="4" w16cid:durableId="2105611789">
+    <w:abstractNumId w:val="1"/>
     <w:lvlOverride w:ilvl="0">
       <w:startOverride w:val="1"/>
     </w:lvlOverride>
   </w:num>
-  <w:num w:numId="3" w16cid:durableId="1375544618">
-    <w:abstractNumId w:val="0"/>
-    <w:lvlOverride w:ilvl="0">
-      <w:startOverride w:val="1"/>
-    </w:lvlOverride>
-  </w:num>
-  <w:num w:numId="4" w16cid:durableId="1187138280">
-    <w:abstractNumId w:val="0"/>
-    <w:lvlOverride w:ilvl="0">
-      <w:startOverride w:val="1"/>
-    </w:lvlOverride>
-  </w:num>
-  <w:num w:numId="5" w16cid:durableId="527640240">
-    <w:abstractNumId w:val="0"/>
+  <w:num w:numId="5" w16cid:durableId="1058479766">
+    <w:abstractNumId w:val="1"/>
     <w:lvlOverride w:ilvl="0">
       <w:startOverride w:val="1"/>
     </w:lvlOverride>

</xml_diff>